<commit_message>
I don't recall this change
</commit_message>
<xml_diff>
--- a/resumes/CPO.docx
+++ b/resumes/CPO.docx
@@ -2167,7 +2167,14 @@
           <w:i/>
           <w:iCs/>
         </w:rPr>
-        <w:t xml:space="preserve"> 2001</w:t>
+        <w:t xml:space="preserve"> 200</w:t>
+      </w:r>
+      <w:r>
+        <w:rPr>
+          <w:i/>
+          <w:iCs/>
+        </w:rPr>
+        <w:t>0</w:t>
       </w:r>
     </w:p>
     <w:p>
@@ -2338,7 +2345,13 @@
         <w:t>Competitive Moat:</w:t>
       </w:r>
       <w:r>
-        <w:t xml:space="preserve"> Expanded the partner ecosystem from 22 to 33 vendors by engineering a "Universal Connector" strategy that enabled </w:t>
+        <w:t xml:space="preserve"> Expanded the partner ecosystem from 22 to 33 vendors</w:t>
+      </w:r>
+      <w:r>
+        <w:t>, covering 50+ ERP systems,</w:t>
+      </w:r>
+      <w:r>
+        <w:t xml:space="preserve"> by engineering a "Universal Connector" strategy that enabled </w:t>
       </w:r>
       <w:proofErr w:type="spellStart"/>
       <w:r>
@@ -2353,7 +2366,7 @@
       <w:pPr>
         <w:numPr>
           <w:ilvl w:val="0"/>
-          <w:numId w:val="5"/>
+          <w:numId w:val="4"/>
         </w:numPr>
         <w:spacing w:before="100" w:beforeAutospacing="1" w:after="100" w:afterAutospacing="1" w:line="240" w:lineRule="auto"/>
       </w:pPr>
@@ -2834,7 +2847,6 @@
         <w:rPr>
           <w:noProof/>
         </w:rPr>
-        <w:lastRenderedPageBreak/>
       </w:r>
       <w:r>
         <w:rPr>
@@ -2865,6 +2877,7 @@
           <w:sz w:val="27"/>
           <w:szCs w:val="27"/>
         </w:rPr>
+        <w:lastRenderedPageBreak/>
         <w:t>Education</w:t>
       </w:r>
     </w:p>

</xml_diff>